<commit_message>
Desenho de som estilo trailer, sem marca de prévia e sem o bullet de cadeia completa
Substitui a trilha provisória e os efeitos avulsos por um score único
(audio/build_score.py -> public/audio/score.wav) sintetizado em numpy/scipy:
sub drops, braams, risers, taikos, tiques, pads, shimmer, reversos, hits e
silêncios de impacto, planejado segundo a segundo. Vinheta muda; remove a
marca PRÉVIA; retira o bullet da cena 5; regenera o roteiro.

Co-Authored-By: Claude Fable 5.1 <noreply@anthropic.com>
Claude-Session: https://claude.ai/code/session_01FxWexhJ8Q1Kdm4uF2JnZqq
</commit_message>
<xml_diff>
--- a/apresentacao-ciprem/roteiro-video-ciprem.docx
+++ b/apresentacao-ciprem/roteiro-video-ciprem.docx
@@ -2552,19 +2552,6 @@
                 <w:szCs w:val="20"/>
               </w:rPr>
               <w:t xml:space="preserve">46.0 s — Pedreiras em plena operação na Bahia e em Minas Gerais  [bullet com traço âmbar]</w:t>
-            </w:r>
-            <w:r>
-              <w:br/>
-            </w:r>
-            <w:r>
-              <w:rPr>
-                <w:rFonts w:ascii="Arial" w:cs="Arial" w:eastAsia="Arial" w:hAnsi="Arial"/>
-                <w:b w:val="false"/>
-                <w:bCs w:val="false"/>
-                <w:sz w:val="20"/>
-                <w:szCs w:val="20"/>
-              </w:rPr>
-              <w:t xml:space="preserve">48.5 s — Da extração ao concreto usinado: cadeia completa  [bullet com traço âmbar]</w:t>
             </w:r>
             <w:r>
               <w:br/>

</xml_diff>

<commit_message>
Score v2 mais suave numa grade única de 120 BPM; contatos reais na cartela final
- Uma grade rítmica para todo o conteúdo (compasso de 2 s ancorado no início),
  com todas as cenas começando em cabeça de compasso, viradas antes de cada
  corte e harmonia contínua por compasso (Ré menor -> Ré maior).
- Timbres suavizados: pads filtrados sem distorção, braams fechados, hits com
  mais corpo e menos ruído, sem caixa/hi-hat/tiques; master em -16 LUFS com
  passa-baixas em 9 kHz.
- Cena 8: e-mail, site e telefones no lugar do placeholder.

Co-Authored-By: Claude Fable 5.1 <noreply@anthropic.com>
Claude-Session: https://claude.ai/code/session_01FxWexhJ8Q1Kdm4uF2JnZqq
</commit_message>
<xml_diff>
--- a/apresentacao-ciprem/roteiro-video-ciprem.docx
+++ b/apresentacao-ciprem/roteiro-video-ciprem.docx
@@ -3737,7 +3737,20 @@
                 <w:sz w:val="20"/>
                 <w:szCs w:val="20"/>
               </w:rPr>
-              <w:t xml:space="preserve">84.5 s — [WhatsApp comercial]  |  [Instagram]  |  [site]  [prata, 28 px. PREENCHER com os contatos reais antes de renderizar.]</w:t>
+              <w:t xml:space="preserve">84.5 s — gerencia1@mineracaosaovicente.com.br  |  www.mineracaosaovicente.com.br</w:t>
+            </w:r>
+            <w:r>
+              <w:br/>
+            </w:r>
+            <w:r>
+              <w:rPr>
+                <w:rFonts w:ascii="Arial" w:cs="Arial" w:eastAsia="Arial" w:hAnsi="Arial"/>
+                <w:b w:val="false"/>
+                <w:bCs w:val="false"/>
+                <w:sz w:val="20"/>
+                <w:szCs w:val="20"/>
+              </w:rPr>
+              <w:t xml:space="preserve">(73) 3262-1601  |  (73) 99983-4832  [prata, 28 px, duas linhas (e-mail e site; telefones)]</w:t>
             </w:r>
             <w:r>
               <w:br/>

</xml_diff>

<commit_message>
Nome fantasia Pedreira Vale do Cricaré no lugar de CIPREM na tela
Cenas 3 e 8 exibem o nome em duas linhas (PEDREIRA pequeno, VALE DO CRICARÉ
grande em prata metálica) via novo componente BrandName. Tempos, som e o
restante dos textos inalterados. Roteiro regenerado.

Co-Authored-By: Claude Fable 5.1 <noreply@anthropic.com>
Claude-Session: https://claude.ai/code/session_01FxWexhJ8Q1Kdm4uF2JnZqq
</commit_message>
<xml_diff>
--- a/apresentacao-ciprem/roteiro-video-ciprem.docx
+++ b/apresentacao-ciprem/roteiro-video-ciprem.docx
@@ -1423,7 +1423,7 @@
           <w:sz w:val="24"/>
           <w:szCs w:val="24"/>
         </w:rPr>
-        <w:t xml:space="preserve">Cena 3 — A SOLUÇÃO (CIPREM)  (00:16.0 → 00:26.0, 250 frames)</w:t>
+        <w:t xml:space="preserve">Cena 3 — A SOLUÇÃO (PEDREIRA VALE DO CRICARÉ)  (00:16.0 → 00:26.0, 250 frames)</w:t>
       </w:r>
     </w:p>
     <w:tbl>
@@ -1587,7 +1587,7 @@
                 <w:sz w:val="20"/>
                 <w:szCs w:val="20"/>
               </w:rPr>
-              <w:t xml:space="preserve">16.0 s — TÍTULO: CIPREM</w:t>
+              <w:t xml:space="preserve">16.0 s — TÍTULO: PEDREIRA VALE DO CRICARÉ</w:t>
             </w:r>
             <w:r>
               <w:br/>
@@ -1663,7 +1663,7 @@
                 <w:sz w:val="20"/>
                 <w:szCs w:val="20"/>
               </w:rPr>
-              <w:t xml:space="preserve">'CIPREM' entra grande (220 px), prata metálica com brilho passando da esquerda para a direita em 20 frames (igual ao logo da vinheta). Apoio abaixo, branco. Em 21 s o título encolhe para o canto superior esquerdo e a frase-chave assume o centro por máscara.</w:t>
+              <w:t xml:space="preserve">'PEDREIRA' pequeno em prata e 'VALE DO CRICARÉ' grande (120 px), prata metálica com brilho passando da esquerda para a direita em 20 frames (igual ao logo da vinheta). Apoio abaixo, branco. Em 21 s o título encolhe para o canto superior esquerdo e a frase-chave assume o centro por máscara.</w:t>
             </w:r>
           </w:p>
         </w:tc>
@@ -3661,7 +3661,7 @@
                 <w:sz w:val="20"/>
                 <w:szCs w:val="20"/>
               </w:rPr>
-              <w:t xml:space="preserve">Alternativa: fundo gerado no Remotion em navy #01002D com partículas, replicando a cartela, para colocar o logo da CIPREM no centro.</w:t>
+              <w:t xml:space="preserve">Alternativa: fundo gerado no Remotion em navy #01002D com partículas, replicando a cartela, para colocar o logo da Pedreira Vale do Cricaré no centro.</w:t>
             </w:r>
           </w:p>
         </w:tc>
@@ -3711,7 +3711,7 @@
                 <w:sz w:val="20"/>
                 <w:szCs w:val="20"/>
               </w:rPr>
-              <w:t xml:space="preserve">80.0 s — TÍTULO: CIPREM  |  GRUPO SÃO VICENTE</w:t>
+              <w:t xml:space="preserve">80.0 s — TÍTULO: PEDREIRA VALE DO CRICARÉ  |  GRUPO SÃO VICENTE</w:t>
             </w:r>
             <w:r>
               <w:br/>
@@ -5350,7 +5350,7 @@
           <w:sz w:val="20"/>
           <w:szCs w:val="20"/>
         </w:rPr>
-        <w:t xml:space="preserve">Gerado por build_roteiro.js a partir de scenes.json em 2026-09-04.</w:t>
+        <w:t xml:space="preserve">Gerado por build_roteiro.js a partir de scenes.json em 2026-09-05.</w:t>
       </w:r>
     </w:p>
     <w:sectPr>

</xml_diff>